<commit_message>
Add the register, the tables, consistency checks and the run to 1969
- Register from the printed general index of 1960 (Zorn): headings and
  volume-and-page references only, the compiler's phrases discarded
  because the index is in copyright (tools/build_general_index.py,
  data/general_index.json, #/register, #/p/VOL/PAGE).
- Its (auth.) marks fill 202 authors of unsigned pieces; all 59 volumes
  rebuilt, pages and text unchanged.
- The fold-out statistics as OCR text and best-effort CSV
  (tools/extract_tables.py, data/tables/, #/tables), 100 tables.
- tools/check_edition.py: manifest, page order, plates, essay citations,
  register, no third-party loads; required before every commit.
- Volumes page lists vols. 60-98 again, catalogue-only, with rights tier.
- Essay v1.2 (register and tables), manuscript rebuilt; release texts
  for v1.0.0 and v1.1.0 in docs/; CITATION.cff 1.1.0.

Co-Authored-By: Claude Fable 5.1 <noreply@anthropic.com>
</commit_message>
<xml_diff>
--- a/docs/Fassbender-2026-Woodstock-Letters-Introduction.docx
+++ b/docs/Fassbender-2026-Woodstock-Letters-Introduction.docx
@@ -1173,6 +1173,49 @@
           <w:rFonts w:ascii="Times New Roman" w:cs="Times New Roman" w:eastAsia="Times New Roman" w:hAnsi="Times New Roman"/>
         </w:rPr>
         <w:t xml:space="preserve">, obituaries, with commemorative and foreign pieces flagged. The year-by-year means, with a resampling band, extend the study's six measurement points to an annual series over fifty-nine years. The connection is exact: the study's own texts, scored from the edition, reproduce the study's values (per-text correlations of .99 and above on every measure), as the published validation report shows.</w:t>
+      </w:r>
+    </w:p>
+    <w:p>
+      <w:pPr>
+        <w:spacing w:line="480"/>
+        <w:ind w:firstLine="720"/>
+        <w:jc w:val="left"/>
+      </w:pPr>
+      <w:r>
+        <w:rPr>
+          <w:i/>
+          <w:iCs/>
+          <w:sz w:val="24"/>
+          <w:szCs w:val="24"/>
+          <w:rFonts w:ascii="Times New Roman" w:cs="Times New Roman" w:eastAsia="Times New Roman" w:hAnsi="Times New Roman"/>
+        </w:rPr>
+        <w:t xml:space="preserve">Register and tables.</w:t>
+      </w:r>
+      <w:r>
+        <w:rPr>
+          <w:sz w:val="24"/>
+          <w:szCs w:val="24"/>
+          <w:rFonts w:ascii="Times New Roman" w:cs="Times New Roman" w:eastAsia="Times New Roman" w:hAnsi="Times New Roman"/>
+        </w:rPr>
+        <w:t xml:space="preserve"> Two further aids come from the journal's own apparatus. The register is the printed general index that George Zorn, S.J., compiled for vols. 1–80 in 1960: its headings, which are names of persons, places and things, and its volume-and-page references, with the compiler's marks for obituaries, authors, reviews and pictures (Zorn, 1960). The index of 1960 is not in the public domain, so the edition takes from it only those facts and none of its phrasing; a reference to a public-domain volume opens the page in the edition, a reference to vols. 60–80 opens the scan. The compiler's author marks also supply the authors of some two hundred otherwise unsigned pieces. The tables are the journal's recurring statistics, the </w:t>
+      </w:r>
+      <w:r>
+        <w:rPr>
+          <w:i/>
+          <w:iCs/>
+          <w:sz w:val="24"/>
+          <w:szCs w:val="24"/>
+          <w:rFonts w:ascii="Times New Roman" w:cs="Times New Roman" w:eastAsia="Times New Roman" w:hAnsi="Times New Roman"/>
+        </w:rPr>
+        <w:t xml:space="preserve">Ministeria spiritualia</w:t>
+      </w:r>
+      <w:r>
+        <w:rPr>
+          <w:sz w:val="24"/>
+          <w:szCs w:val="24"/>
+          <w:rFonts w:ascii="Times New Roman" w:cs="Times New Roman" w:eastAsia="Times New Roman" w:hAnsi="Times New Roman"/>
+        </w:rPr>
+        <w:t xml:space="preserve"> of every house, the students in every college of the United States and Canada, the list of the dead, printed on unnumbered fold-out leaves that the text leaves out like plates: the edition gives them as the OCR read them, line by line, with a best-effort CSV of each, and links each to its scan, because the column headings of a fold-out are seldom read whole.</w:t>
       </w:r>
     </w:p>
     <w:p>
@@ -2129,6 +2172,39 @@
           <w:rFonts w:ascii="Times New Roman" w:cs="Times New Roman" w:eastAsia="Times New Roman" w:hAnsi="Times New Roman"/>
         </w:rPr>
         <w:t xml:space="preserve"> (Vols. 1–98). (1872–1969). Woodstock College Press.</w:t>
+      </w:r>
+    </w:p>
+    <w:p>
+      <w:pPr>
+        <w:spacing w:line="480"/>
+        <w:ind w:left="720" w:hanging="720"/>
+        <w:jc w:val="left"/>
+      </w:pPr>
+      <w:r>
+        <w:rPr>
+          <w:sz w:val="24"/>
+          <w:szCs w:val="24"/>
+          <w:rFonts w:ascii="Times New Roman" w:cs="Times New Roman" w:eastAsia="Times New Roman" w:hAnsi="Times New Roman"/>
+        </w:rPr>
+        <w:t xml:space="preserve">Zorn, G. (Comp.). (1960). </w:t>
+      </w:r>
+      <w:r>
+        <w:rPr>
+          <w:i/>
+          <w:iCs/>
+          <w:sz w:val="24"/>
+          <w:szCs w:val="24"/>
+          <w:rFonts w:ascii="Times New Roman" w:cs="Times New Roman" w:eastAsia="Times New Roman" w:hAnsi="Times New Roman"/>
+        </w:rPr>
+        <w:t xml:space="preserve">Woodstock Letters index, volumes 1–80, 1872–1951</w:t>
+      </w:r>
+      <w:r>
+        <w:rPr>
+          <w:sz w:val="24"/>
+          <w:szCs w:val="24"/>
+          <w:rFonts w:ascii="Times New Roman" w:cs="Times New Roman" w:eastAsia="Times New Roman" w:hAnsi="Times New Roman"/>
+        </w:rPr>
+        <w:t xml:space="preserve">. Woodstock College Press. https://archive.org/details/woodstockletters1801unse</w:t>
       </w:r>
     </w:p>
     <w:p>

</xml_diff>

<commit_message>
Enter the Zenodo DOIs of v1.0.0
Concept DOI 10.5281/zenodo.22967521 and version DOI 10.5281/zenodo.22967522
in CITATION.cff, the JSON-LD, the About page's citation, the README and
the essay (v1.3, manuscript rebuilt).

Co-Authored-By: Claude Fable 5.1 <noreply@anthropic.com>
</commit_message>
<xml_diff>
--- a/docs/Fassbender-2026-Woodstock-Letters-Introduction.docx
+++ b/docs/Fassbender-2026-Woodstock-Letters-Introduction.docx
@@ -161,7 +161,7 @@
           <w:szCs w:val="24"/>
           <w:rFonts w:ascii="Times New Roman" w:cs="Times New Roman" w:eastAsia="Times New Roman" w:hAnsi="Times New Roman"/>
         </w:rPr>
-        <w:t xml:space="preserve"> and serves as its introductory text. The edition and the first draft of this essay were produced with a generative AI system, Claude (Anthropic, 2026), in the manner of what Floridi (in press) calls distant writing; the use is described in the section “How the Edition Was Made”, in accordance with APA Style guidance on generative AI (McAdoo, 2024). The author designed the edition, chose and cleared its sources, decided its rules, reviewed every batch of its output and revised this text, and is responsible for the whole. The author has no conflicts of interest to disclose. The essay is released under CC BY 4.0, the edition's code under the MIT licence and its derived data under CC0 1.0; the journal's text is in the public domain. Repository: https://github.com/pantaleonfassbender-coder/woodstock-letters. Correspondence: pantaleonfassbender@gmail.com.</w:t>
+        <w:t xml:space="preserve"> and serves as its introductory text. The edition and the first draft of this essay were produced with a generative AI system, Claude (Anthropic, 2026), in the manner of what Floridi (in press) calls distant writing; the use is described in the section “How the Edition Was Made”, in accordance with APA Style guidance on generative AI (McAdoo, 2024). The author designed the edition, chose and cleared its sources, decided its rules, reviewed every batch of its output and revised this text, and is responsible for the whole. The author has no conflicts of interest to disclose. The essay is released under CC BY 4.0, the edition's code under the MIT licence and its derived data under CC0 1.0; the journal's text is in the public domain. Repository: https://github.com/pantaleonfassbender-coder/woodstock-letters; archived: https://doi.org/10.5281/zenodo.22967521. Correspondence: pantaleonfassbender@gmail.com.</w:t>
       </w:r>
     </w:p>
     <w:p>
@@ -322,7 +322,7 @@
           <w:szCs w:val="24"/>
           <w:rFonts w:ascii="Times New Roman" w:cs="Times New Roman" w:eastAsia="Times New Roman" w:hAnsi="Times New Roman"/>
         </w:rPr>
-        <w:t xml:space="preserve">This essay introduces a digital research edition of the part of that run which is now in the public domain in the United States: the fifty-nine volumes published from 1872 to 1930. The edition is a companion to </w:t>
+        <w:t xml:space="preserve">This essay introduces a digital research edition of the part of that run which is now in the public domain in the United States: the fifty-nine volumes published from 1872 to 1930 (Fassbender, 2026c). The edition is a companion to </w:t>
       </w:r>
       <w:r>
         <w:rPr>
@@ -1784,6 +1784,39 @@
           <w:rFonts w:ascii="Times New Roman" w:cs="Times New Roman" w:eastAsia="Times New Roman" w:hAnsi="Times New Roman"/>
         </w:rPr>
         <w:t xml:space="preserve"> [Replication package]. Zenodo. https://doi.org/10.5281/zenodo.22697014</w:t>
+      </w:r>
+    </w:p>
+    <w:p>
+      <w:pPr>
+        <w:spacing w:line="480"/>
+        <w:ind w:left="720" w:hanging="720"/>
+        <w:jc w:val="left"/>
+      </w:pPr>
+      <w:r>
+        <w:rPr>
+          <w:sz w:val="24"/>
+          <w:szCs w:val="24"/>
+          <w:rFonts w:ascii="Times New Roman" w:cs="Times New Roman" w:eastAsia="Times New Roman" w:hAnsi="Times New Roman"/>
+        </w:rPr>
+        <w:t xml:space="preserve">Fassbender, P. (2026c). </w:t>
+      </w:r>
+      <w:r>
+        <w:rPr>
+          <w:i/>
+          <w:iCs/>
+          <w:sz w:val="24"/>
+          <w:szCs w:val="24"/>
+          <w:rFonts w:ascii="Times New Roman" w:cs="Times New Roman" w:eastAsia="Times New Roman" w:hAnsi="Times New Roman"/>
+        </w:rPr>
+        <w:t xml:space="preserve">Woodstock Letters: A research edition</w:t>
+      </w:r>
+      <w:r>
+        <w:rPr>
+          <w:sz w:val="24"/>
+          <w:szCs w:val="24"/>
+          <w:rFonts w:ascii="Times New Roman" w:cs="Times New Roman" w:eastAsia="Times New Roman" w:hAnsi="Times New Roman"/>
+        </w:rPr>
+        <w:t xml:space="preserve"> (Version 1.0.0) [Data set]. Zenodo. https://doi.org/10.5281/zenodo.22967521</w:t>
       </w:r>
     </w:p>
     <w:p>

</xml_diff>